<commit_message>
Realice los cambios propuestos por la Dra Azucena para la tarea del avance 3
</commit_message>
<xml_diff>
--- a/Revisiones-Tesina/Justificacio-Del-Problema-Objetivos/ANTEPROYECTO AV3 GUSTAVO DE JESUS ESCOBAR MATA.docx
+++ b/Revisiones-Tesina/Justificacio-Del-Problema-Objetivos/ANTEPROYECTO AV3 GUSTAVO DE JESUS ESCOBAR MATA.docx
@@ -801,57 +801,107 @@
           <w:rFonts w:ascii="Arial" w:hAnsi="Arial" w:cs="Arial"/>
           <w:lang w:val="es-ES"/>
         </w:rPr>
-        <w:t>(Título y nombre)                                         (Título y nombre)</w:t>
-      </w:r>
-    </w:p>
-    <w:p>
-      <w:pPr>
-        <w:jc w:val="center"/>
-        <w:rPr>
-          <w:rFonts w:ascii="Arial" w:hAnsi="Arial" w:cs="Arial"/>
-          <w:lang w:val="es-ES"/>
-        </w:rPr>
-      </w:pPr>
-      <w:r>
-        <w:rPr>
-          <w:rFonts w:ascii="Arial" w:hAnsi="Arial" w:cs="Arial"/>
-          <w:lang w:val="es-ES"/>
-        </w:rPr>
-        <w:t>Revisor                                                        Revisor</w:t>
-      </w:r>
-    </w:p>
-    <w:p>
-      <w:pPr>
-        <w:jc w:val="center"/>
-        <w:rPr>
-          <w:rFonts w:ascii="Arial" w:hAnsi="Arial" w:cs="Arial"/>
-          <w:lang w:val="es-ES"/>
-        </w:rPr>
-      </w:pPr>
-    </w:p>
-    <w:p>
-      <w:pPr>
-        <w:jc w:val="center"/>
-        <w:rPr>
-          <w:rFonts w:ascii="Arial" w:hAnsi="Arial" w:cs="Arial"/>
-          <w:lang w:val="es-ES"/>
-        </w:rPr>
-      </w:pPr>
-    </w:p>
-    <w:p>
-      <w:pPr>
-        <w:jc w:val="center"/>
-        <w:rPr>
-          <w:rFonts w:ascii="Arial" w:hAnsi="Arial" w:cs="Arial"/>
-          <w:lang w:val="es-ES"/>
-        </w:rPr>
-      </w:pPr>
-      <w:r>
-        <w:rPr>
-          <w:rFonts w:ascii="Arial" w:hAnsi="Arial" w:cs="Arial"/>
-          <w:lang w:val="es-ES"/>
-        </w:rPr>
-        <w:t>Vo.Bo.</w:t>
+        <w:t xml:space="preserve">(Título y </w:t>
+      </w:r>
+      <w:proofErr w:type="gramStart"/>
+      <w:r>
+        <w:rPr>
+          <w:rFonts w:ascii="Arial" w:hAnsi="Arial" w:cs="Arial"/>
+          <w:lang w:val="es-ES"/>
+        </w:rPr>
+        <w:t xml:space="preserve">nombre)   </w:t>
+      </w:r>
+      <w:proofErr w:type="gramEnd"/>
+      <w:r>
+        <w:rPr>
+          <w:rFonts w:ascii="Arial" w:hAnsi="Arial" w:cs="Arial"/>
+          <w:lang w:val="es-ES"/>
+        </w:rPr>
+        <w:t xml:space="preserve">                                   </w:t>
+      </w:r>
+      <w:proofErr w:type="gramStart"/>
+      <w:r>
+        <w:rPr>
+          <w:rFonts w:ascii="Arial" w:hAnsi="Arial" w:cs="Arial"/>
+          <w:lang w:val="es-ES"/>
+        </w:rPr>
+        <w:t xml:space="preserve">   (</w:t>
+      </w:r>
+      <w:proofErr w:type="gramEnd"/>
+      <w:r>
+        <w:rPr>
+          <w:rFonts w:ascii="Arial" w:hAnsi="Arial" w:cs="Arial"/>
+          <w:lang w:val="es-ES"/>
+        </w:rPr>
+        <w:t>Título y nombre)</w:t>
+      </w:r>
+    </w:p>
+    <w:p>
+      <w:pPr>
+        <w:jc w:val="center"/>
+        <w:rPr>
+          <w:rFonts w:ascii="Arial" w:hAnsi="Arial" w:cs="Arial"/>
+          <w:lang w:val="es-ES"/>
+        </w:rPr>
+      </w:pPr>
+      <w:r>
+        <w:rPr>
+          <w:rFonts w:ascii="Arial" w:hAnsi="Arial" w:cs="Arial"/>
+          <w:lang w:val="es-ES"/>
+        </w:rPr>
+        <w:t xml:space="preserve">Revisor                                                        </w:t>
+      </w:r>
+      <w:proofErr w:type="spellStart"/>
+      <w:r>
+        <w:rPr>
+          <w:rFonts w:ascii="Arial" w:hAnsi="Arial" w:cs="Arial"/>
+          <w:lang w:val="es-ES"/>
+        </w:rPr>
+        <w:t>Revisor</w:t>
+      </w:r>
+      <w:proofErr w:type="spellEnd"/>
+    </w:p>
+    <w:p>
+      <w:pPr>
+        <w:jc w:val="center"/>
+        <w:rPr>
+          <w:rFonts w:ascii="Arial" w:hAnsi="Arial" w:cs="Arial"/>
+          <w:lang w:val="es-ES"/>
+        </w:rPr>
+      </w:pPr>
+    </w:p>
+    <w:p>
+      <w:pPr>
+        <w:jc w:val="center"/>
+        <w:rPr>
+          <w:rFonts w:ascii="Arial" w:hAnsi="Arial" w:cs="Arial"/>
+          <w:lang w:val="es-ES"/>
+        </w:rPr>
+      </w:pPr>
+    </w:p>
+    <w:p>
+      <w:pPr>
+        <w:jc w:val="center"/>
+        <w:rPr>
+          <w:rFonts w:ascii="Arial" w:hAnsi="Arial" w:cs="Arial"/>
+          <w:lang w:val="es-ES"/>
+        </w:rPr>
+      </w:pPr>
+      <w:proofErr w:type="spellStart"/>
+      <w:r>
+        <w:rPr>
+          <w:rFonts w:ascii="Arial" w:hAnsi="Arial" w:cs="Arial"/>
+          <w:lang w:val="es-ES"/>
+        </w:rPr>
+        <w:t>Vo.Bo</w:t>
+      </w:r>
+      <w:proofErr w:type="spellEnd"/>
+      <w:r>
+        <w:rPr>
+          <w:rFonts w:ascii="Arial" w:hAnsi="Arial" w:cs="Arial"/>
+          <w:lang w:val="es-ES"/>
+        </w:rPr>
+        <w:t>.</w:t>
       </w:r>
     </w:p>
     <w:p>
@@ -1399,7 +1449,139 @@
         <w:rPr>
           <w:rFonts w:ascii="Arial" w:hAnsi="Arial" w:cs="Arial"/>
         </w:rPr>
-        <w:t>(Subtítulo)…………</w:t>
+        <w:t>(Subtítulo)……</w:t>
+      </w:r>
+      <w:proofErr w:type="gramStart"/>
+      <w:r>
+        <w:rPr>
+          <w:rFonts w:ascii="Arial" w:hAnsi="Arial" w:cs="Arial"/>
+        </w:rPr>
+        <w:t>……</w:t>
+      </w:r>
+      <w:r>
+        <w:rPr>
+          <w:rFonts w:ascii="Arial" w:hAnsi="Arial" w:cs="Arial"/>
+        </w:rPr>
+        <w:t>.</w:t>
+      </w:r>
+      <w:proofErr w:type="gramEnd"/>
+      <w:r>
+        <w:rPr>
+          <w:rFonts w:ascii="Arial" w:hAnsi="Arial" w:cs="Arial"/>
+        </w:rPr>
+        <w:t>.</w:t>
+      </w:r>
+      <w:r>
+        <w:rPr>
+          <w:rFonts w:ascii="Arial" w:hAnsi="Arial" w:cs="Arial"/>
+        </w:rPr>
+        <w:t>……………………………………</w:t>
+      </w:r>
+      <w:r>
+        <w:rPr>
+          <w:rFonts w:ascii="Arial" w:hAnsi="Arial" w:cs="Arial"/>
+        </w:rPr>
+        <w:t>……</w:t>
+      </w:r>
+      <w:proofErr w:type="gramStart"/>
+      <w:r>
+        <w:rPr>
+          <w:rFonts w:ascii="Arial" w:hAnsi="Arial" w:cs="Arial"/>
+        </w:rPr>
+        <w:t>…….</w:t>
+      </w:r>
+      <w:proofErr w:type="gramEnd"/>
+      <w:r>
+        <w:rPr>
+          <w:rFonts w:ascii="Arial" w:hAnsi="Arial" w:cs="Arial"/>
+        </w:rPr>
+        <w:t>1</w:t>
+      </w:r>
+    </w:p>
+    <w:p>
+      <w:pPr>
+        <w:rPr>
+          <w:rFonts w:ascii="Arial" w:hAnsi="Arial" w:cs="Arial"/>
+        </w:rPr>
+      </w:pPr>
+      <w:r>
+        <w:rPr>
+          <w:rFonts w:ascii="Arial" w:hAnsi="Arial" w:cs="Arial"/>
+          <w:lang w:val="es-ES"/>
+        </w:rPr>
+        <w:tab/>
+      </w:r>
+      <w:r>
+        <w:rPr>
+          <w:rFonts w:ascii="Arial" w:hAnsi="Arial" w:cs="Arial"/>
+        </w:rPr>
+        <w:t xml:space="preserve">           1.1.1 (Subtítulo)………………………………</w:t>
+      </w:r>
+      <w:r>
+        <w:rPr>
+          <w:rFonts w:ascii="Arial" w:hAnsi="Arial" w:cs="Arial"/>
+        </w:rPr>
+        <w:t>………………</w:t>
+      </w:r>
+      <w:proofErr w:type="gramStart"/>
+      <w:r>
+        <w:rPr>
+          <w:rFonts w:ascii="Arial" w:hAnsi="Arial" w:cs="Arial"/>
+        </w:rPr>
+        <w:t>……</w:t>
+      </w:r>
+      <w:r>
+        <w:rPr>
+          <w:rFonts w:ascii="Arial" w:hAnsi="Arial" w:cs="Arial"/>
+        </w:rPr>
+        <w:t>.</w:t>
+      </w:r>
+      <w:proofErr w:type="gramEnd"/>
+      <w:r>
+        <w:rPr>
+          <w:rFonts w:ascii="Arial" w:hAnsi="Arial" w:cs="Arial"/>
+        </w:rPr>
+        <w:t>1</w:t>
+      </w:r>
+    </w:p>
+    <w:p>
+      <w:pPr>
+        <w:rPr>
+          <w:rFonts w:ascii="Arial" w:hAnsi="Arial" w:cs="Arial"/>
+        </w:rPr>
+      </w:pPr>
+      <w:r>
+        <w:rPr>
+          <w:rFonts w:ascii="Arial" w:hAnsi="Arial" w:cs="Arial"/>
+        </w:rPr>
+        <w:t xml:space="preserve">             1.2</w:t>
+      </w:r>
+      <w:proofErr w:type="gramStart"/>
+      <w:r>
+        <w:rPr>
+          <w:rFonts w:ascii="Arial" w:hAnsi="Arial" w:cs="Arial"/>
+        </w:rPr>
+        <w:t xml:space="preserve">   (</w:t>
+      </w:r>
+      <w:proofErr w:type="gramEnd"/>
+      <w:r>
+        <w:rPr>
+          <w:rFonts w:ascii="Arial" w:hAnsi="Arial" w:cs="Arial"/>
+        </w:rPr>
+        <w:t>Subtítulo)……………………………………………………</w:t>
+      </w:r>
+      <w:r>
+        <w:rPr>
+          <w:rFonts w:ascii="Arial" w:hAnsi="Arial" w:cs="Arial"/>
+        </w:rPr>
+        <w:t>…</w:t>
+      </w:r>
+      <w:proofErr w:type="gramStart"/>
+      <w:r>
+        <w:rPr>
+          <w:rFonts w:ascii="Arial" w:hAnsi="Arial" w:cs="Arial"/>
+        </w:rPr>
+        <w:t>….</w:t>
       </w:r>
       <w:r>
         <w:rPr>
@@ -1411,95 +1593,9 @@
         <w:rPr>
           <w:rFonts w:ascii="Arial" w:hAnsi="Arial" w:cs="Arial"/>
         </w:rPr>
-        <w:t>……………………………………</w:t>
-      </w:r>
-      <w:r>
-        <w:rPr>
-          <w:rFonts w:ascii="Arial" w:hAnsi="Arial" w:cs="Arial"/>
-        </w:rPr>
-        <w:t>……</w:t>
-      </w:r>
-      <w:r>
-        <w:rPr>
-          <w:rFonts w:ascii="Arial" w:hAnsi="Arial" w:cs="Arial"/>
-        </w:rPr>
-        <w:t>…….</w:t>
-      </w:r>
-      <w:r>
-        <w:rPr>
-          <w:rFonts w:ascii="Arial" w:hAnsi="Arial" w:cs="Arial"/>
-        </w:rPr>
-        <w:t>1</w:t>
-      </w:r>
-    </w:p>
-    <w:p>
-      <w:pPr>
-        <w:rPr>
-          <w:rFonts w:ascii="Arial" w:hAnsi="Arial" w:cs="Arial"/>
-        </w:rPr>
-      </w:pPr>
-      <w:r>
-        <w:rPr>
-          <w:rFonts w:ascii="Arial" w:hAnsi="Arial" w:cs="Arial"/>
-          <w:lang w:val="es-ES"/>
-        </w:rPr>
-        <w:tab/>
-      </w:r>
-      <w:r>
-        <w:rPr>
-          <w:rFonts w:ascii="Arial" w:hAnsi="Arial" w:cs="Arial"/>
-        </w:rPr>
-        <w:t xml:space="preserve">           1.1.1 (Subtítulo)………………………………</w:t>
-      </w:r>
-      <w:r>
-        <w:rPr>
-          <w:rFonts w:ascii="Arial" w:hAnsi="Arial" w:cs="Arial"/>
-        </w:rPr>
-        <w:t>……………………</w:t>
-      </w:r>
-      <w:r>
-        <w:rPr>
-          <w:rFonts w:ascii="Arial" w:hAnsi="Arial" w:cs="Arial"/>
-        </w:rPr>
         <w:t>.</w:t>
       </w:r>
-      <w:r>
-        <w:rPr>
-          <w:rFonts w:ascii="Arial" w:hAnsi="Arial" w:cs="Arial"/>
-        </w:rPr>
-        <w:t>1</w:t>
-      </w:r>
-    </w:p>
-    <w:p>
-      <w:pPr>
-        <w:rPr>
-          <w:rFonts w:ascii="Arial" w:hAnsi="Arial" w:cs="Arial"/>
-        </w:rPr>
-      </w:pPr>
-      <w:r>
-        <w:rPr>
-          <w:rFonts w:ascii="Arial" w:hAnsi="Arial" w:cs="Arial"/>
-        </w:rPr>
-        <w:t xml:space="preserve">             1.2   (Subtítulo)……………………………………………………</w:t>
-      </w:r>
-      <w:r>
-        <w:rPr>
-          <w:rFonts w:ascii="Arial" w:hAnsi="Arial" w:cs="Arial"/>
-        </w:rPr>
-        <w:t>…….</w:t>
-      </w:r>
-      <w:r>
-        <w:rPr>
-          <w:rFonts w:ascii="Arial" w:hAnsi="Arial" w:cs="Arial"/>
-        </w:rPr>
-        <w:t>..</w:t>
-      </w:r>
-      <w:r>
-        <w:rPr>
-          <w:rFonts w:ascii="Arial" w:hAnsi="Arial" w:cs="Arial"/>
-        </w:rPr>
-        <w:t>.</w:t>
-      </w:r>
+      <w:proofErr w:type="gramEnd"/>
       <w:r>
         <w:rPr>
           <w:rFonts w:ascii="Arial" w:hAnsi="Arial" w:cs="Arial"/>
@@ -1615,7 +1711,15 @@
           <w:rFonts w:ascii="Arial" w:hAnsi="Arial" w:cs="Arial"/>
           <w:lang w:val="es-ES"/>
         </w:rPr>
-        <w:t xml:space="preserve">2.1  </w:t>
+        <w:t>2.1</w:t>
+      </w:r>
+      <w:proofErr w:type="gramStart"/>
+      <w:r>
+        <w:rPr>
+          <w:rFonts w:ascii="Arial" w:hAnsi="Arial" w:cs="Arial"/>
+          <w:lang w:val="es-ES"/>
+        </w:rPr>
+        <w:t xml:space="preserve">  </w:t>
       </w:r>
       <w:r>
         <w:rPr>
@@ -1629,7 +1733,15 @@
           <w:rFonts w:ascii="Arial" w:hAnsi="Arial" w:cs="Arial"/>
           <w:lang w:val="es-ES"/>
         </w:rPr>
-        <w:t xml:space="preserve">(Subtítulo) </w:t>
+        <w:t>(</w:t>
+      </w:r>
+      <w:proofErr w:type="gramEnd"/>
+      <w:r>
+        <w:rPr>
+          <w:rFonts w:ascii="Arial" w:hAnsi="Arial" w:cs="Arial"/>
+          <w:lang w:val="es-ES"/>
+        </w:rPr>
+        <w:t xml:space="preserve">Subtítulo) </w:t>
       </w:r>
       <w:r>
         <w:rPr>
@@ -1722,7 +1834,21 @@
         <w:rPr>
           <w:rFonts w:ascii="Arial" w:hAnsi="Arial" w:cs="Arial"/>
         </w:rPr>
-        <w:t>4.    FORMULACIÓN DE OBJETIVOS…………………………..…</w:t>
+        <w:t>4.    FORMULACIÓN DE OBJETIVOS……………………</w:t>
+      </w:r>
+      <w:proofErr w:type="gramStart"/>
+      <w:r>
+        <w:rPr>
+          <w:rFonts w:ascii="Arial" w:hAnsi="Arial" w:cs="Arial"/>
+        </w:rPr>
+        <w:t>…….</w:t>
+      </w:r>
+      <w:proofErr w:type="gramEnd"/>
+      <w:r>
+        <w:rPr>
+          <w:rFonts w:ascii="Arial" w:hAnsi="Arial" w:cs="Arial"/>
+        </w:rPr>
+        <w:t>.…</w:t>
       </w:r>
       <w:r>
         <w:rPr>
@@ -1799,14 +1925,36 @@
         <w:rPr>
           <w:rFonts w:ascii="Arial" w:hAnsi="Arial" w:cs="Arial"/>
         </w:rPr>
-        <w:t>6.    METODOLOGÍA………………………………………………....…</w:t>
-      </w:r>
-      <w:r>
-        <w:rPr>
-          <w:rFonts w:ascii="Arial" w:hAnsi="Arial" w:cs="Arial"/>
-        </w:rPr>
-        <w:t>………....</w:t>
-      </w:r>
+        <w:t>6.    METODOLOGÍA……………………………………………</w:t>
+      </w:r>
+      <w:proofErr w:type="gramStart"/>
+      <w:r>
+        <w:rPr>
+          <w:rFonts w:ascii="Arial" w:hAnsi="Arial" w:cs="Arial"/>
+        </w:rPr>
+        <w:t>…....</w:t>
+      </w:r>
+      <w:proofErr w:type="gramEnd"/>
+      <w:r>
+        <w:rPr>
+          <w:rFonts w:ascii="Arial" w:hAnsi="Arial" w:cs="Arial"/>
+        </w:rPr>
+        <w:t>…</w:t>
+      </w:r>
+      <w:r>
+        <w:rPr>
+          <w:rFonts w:ascii="Arial" w:hAnsi="Arial" w:cs="Arial"/>
+        </w:rPr>
+        <w:t>……</w:t>
+      </w:r>
+      <w:proofErr w:type="gramStart"/>
+      <w:r>
+        <w:rPr>
+          <w:rFonts w:ascii="Arial" w:hAnsi="Arial" w:cs="Arial"/>
+        </w:rPr>
+        <w:t>…....</w:t>
+      </w:r>
+      <w:proofErr w:type="gramEnd"/>
       <w:r>
         <w:rPr>
           <w:rFonts w:ascii="Arial" w:hAnsi="Arial" w:cs="Arial"/>
@@ -1953,7 +2101,21 @@
         <w:rPr>
           <w:rFonts w:ascii="Arial" w:hAnsi="Arial" w:cs="Arial"/>
         </w:rPr>
-        <w:t>…………………………………………….....……….......</w:t>
+        <w:t>…………………………………………</w:t>
+      </w:r>
+      <w:proofErr w:type="gramStart"/>
+      <w:r>
+        <w:rPr>
+          <w:rFonts w:ascii="Arial" w:hAnsi="Arial" w:cs="Arial"/>
+        </w:rPr>
+        <w:t>…....</w:t>
+      </w:r>
+      <w:proofErr w:type="gramEnd"/>
+      <w:r>
+        <w:rPr>
+          <w:rFonts w:ascii="Arial" w:hAnsi="Arial" w:cs="Arial"/>
+        </w:rPr>
+        <w:t>.……….......</w:t>
       </w:r>
       <w:r>
         <w:rPr>
@@ -2010,7 +2172,21 @@
         <w:rPr>
           <w:rFonts w:ascii="Arial" w:hAnsi="Arial" w:cs="Arial"/>
         </w:rPr>
-        <w:t>...........…………………………………………….....……….............</w:t>
+        <w:t>...........…………………………………………</w:t>
+      </w:r>
+      <w:proofErr w:type="gramStart"/>
+      <w:r>
+        <w:rPr>
+          <w:rFonts w:ascii="Arial" w:hAnsi="Arial" w:cs="Arial"/>
+        </w:rPr>
+        <w:t>…....</w:t>
+      </w:r>
+      <w:proofErr w:type="gramEnd"/>
+      <w:r>
+        <w:rPr>
+          <w:rFonts w:ascii="Arial" w:hAnsi="Arial" w:cs="Arial"/>
+        </w:rPr>
+        <w:t>.……….............</w:t>
       </w:r>
       <w:r>
         <w:rPr>
@@ -3921,11 +4097,19 @@
         </w:rPr>
         <w:t xml:space="preserve">Redacción alusiva al primer subtema de este capítulo. </w:t>
       </w:r>
-      <w:r>
-        <w:rPr>
-          <w:rFonts w:ascii="Arial" w:hAnsi="Arial" w:cs="Arial"/>
-        </w:rPr>
-        <w:t>JkadkjfhkhdsfkDFLKLKJdklfj.</w:t>
+      <w:proofErr w:type="spellStart"/>
+      <w:r>
+        <w:rPr>
+          <w:rFonts w:ascii="Arial" w:hAnsi="Arial" w:cs="Arial"/>
+        </w:rPr>
+        <w:t>JkadkjfhkhdsfkDFLKLKJdklfj</w:t>
+      </w:r>
+      <w:proofErr w:type="spellEnd"/>
+      <w:r>
+        <w:rPr>
+          <w:rFonts w:ascii="Arial" w:hAnsi="Arial" w:cs="Arial"/>
+        </w:rPr>
+        <w:t>.</w:t>
       </w:r>
     </w:p>
     <w:p>
@@ -3946,8 +4130,65 @@
           <w:rFonts w:ascii="Arial" w:hAnsi="Arial" w:cs="Arial"/>
         </w:rPr>
         <w:tab/>
-        <w:t>Nfdkjdksfjng.nsfd.gn .lnkfglkfg lkdjfgñlkjsdñflkgjlkjfdg ñlsdjfglkjfdlkgj lkjglkjslkjg</w:t>
-      </w:r>
+      </w:r>
+      <w:proofErr w:type="gramStart"/>
+      <w:r>
+        <w:rPr>
+          <w:rFonts w:ascii="Arial" w:hAnsi="Arial" w:cs="Arial"/>
+        </w:rPr>
+        <w:t>Nfdkjdksfjng.nsfd.gn .</w:t>
+      </w:r>
+      <w:proofErr w:type="spellStart"/>
+      <w:r>
+        <w:rPr>
+          <w:rFonts w:ascii="Arial" w:hAnsi="Arial" w:cs="Arial"/>
+        </w:rPr>
+        <w:t>lnkfglkfg</w:t>
+      </w:r>
+      <w:proofErr w:type="spellEnd"/>
+      <w:proofErr w:type="gramEnd"/>
+      <w:r>
+        <w:rPr>
+          <w:rFonts w:ascii="Arial" w:hAnsi="Arial" w:cs="Arial"/>
+        </w:rPr>
+        <w:t xml:space="preserve"> </w:t>
+      </w:r>
+      <w:proofErr w:type="spellStart"/>
+      <w:r>
+        <w:rPr>
+          <w:rFonts w:ascii="Arial" w:hAnsi="Arial" w:cs="Arial"/>
+        </w:rPr>
+        <w:t>lkdjfgñlkjsdñflkgjlkjfdg</w:t>
+      </w:r>
+      <w:proofErr w:type="spellEnd"/>
+      <w:r>
+        <w:rPr>
+          <w:rFonts w:ascii="Arial" w:hAnsi="Arial" w:cs="Arial"/>
+        </w:rPr>
+        <w:t xml:space="preserve"> </w:t>
+      </w:r>
+      <w:proofErr w:type="spellStart"/>
+      <w:r>
+        <w:rPr>
+          <w:rFonts w:ascii="Arial" w:hAnsi="Arial" w:cs="Arial"/>
+        </w:rPr>
+        <w:t>ñlsdjfglkjfdlkgj</w:t>
+      </w:r>
+      <w:proofErr w:type="spellEnd"/>
+      <w:r>
+        <w:rPr>
+          <w:rFonts w:ascii="Arial" w:hAnsi="Arial" w:cs="Arial"/>
+        </w:rPr>
+        <w:t xml:space="preserve"> </w:t>
+      </w:r>
+      <w:proofErr w:type="spellStart"/>
+      <w:r>
+        <w:rPr>
+          <w:rFonts w:ascii="Arial" w:hAnsi="Arial" w:cs="Arial"/>
+        </w:rPr>
+        <w:t>lkjglkjslkjg</w:t>
+      </w:r>
+      <w:proofErr w:type="spellEnd"/>
     </w:p>
     <w:p>
       <w:pPr>
@@ -3975,12 +4216,14 @@
         </w:rPr>
         <w:t>1.1.1</w:t>
       </w:r>
+      <w:proofErr w:type="gramStart"/>
       <w:r>
         <w:rPr>
           <w:rFonts w:ascii="Arial" w:hAnsi="Arial" w:cs="Arial"/>
         </w:rPr>
         <w:t xml:space="preserve">   (</w:t>
       </w:r>
+      <w:proofErr w:type="gramEnd"/>
       <w:r>
         <w:rPr>
           <w:rFonts w:ascii="Arial" w:hAnsi="Arial" w:cs="Arial"/>
@@ -4064,11 +4307,19 @@
         </w:rPr>
         <w:t xml:space="preserve">Redacción alusiva al primer subtema de este capítulo. </w:t>
       </w:r>
-      <w:r>
-        <w:rPr>
-          <w:rFonts w:ascii="Arial" w:hAnsi="Arial" w:cs="Arial"/>
-        </w:rPr>
-        <w:t>JkadkjfhkhdsfkDFLKLKJdklfj.</w:t>
+      <w:proofErr w:type="spellStart"/>
+      <w:r>
+        <w:rPr>
+          <w:rFonts w:ascii="Arial" w:hAnsi="Arial" w:cs="Arial"/>
+        </w:rPr>
+        <w:t>JkadkjfhkhdsfkDFLKLKJdklfj</w:t>
+      </w:r>
+      <w:proofErr w:type="spellEnd"/>
+      <w:r>
+        <w:rPr>
+          <w:rFonts w:ascii="Arial" w:hAnsi="Arial" w:cs="Arial"/>
+        </w:rPr>
+        <w:t>.</w:t>
       </w:r>
     </w:p>
     <w:p>
@@ -4282,12 +4533,14 @@
         </w:rPr>
         <w:t>2.1.1</w:t>
       </w:r>
+      <w:proofErr w:type="gramStart"/>
       <w:r>
         <w:rPr>
           <w:rFonts w:ascii="Arial" w:hAnsi="Arial" w:cs="Arial"/>
         </w:rPr>
         <w:t xml:space="preserve">   (</w:t>
       </w:r>
+      <w:proofErr w:type="gramEnd"/>
       <w:r>
         <w:rPr>
           <w:rFonts w:ascii="Arial" w:hAnsi="Arial" w:cs="Arial"/>
@@ -4700,11 +4953,47 @@
         </w:rPr>
         <w:t>(</w:t>
       </w:r>
-      <w:r>
-        <w:rPr>
-          <w:rFonts w:ascii="Arial" w:hAnsi="Arial" w:cs="Arial"/>
-        </w:rPr>
-        <w:t xml:space="preserve">United Nations Office on Drugs and Crime </w:t>
+      <w:proofErr w:type="spellStart"/>
+      <w:r>
+        <w:rPr>
+          <w:rFonts w:ascii="Arial" w:hAnsi="Arial" w:cs="Arial"/>
+        </w:rPr>
+        <w:t>United</w:t>
+      </w:r>
+      <w:proofErr w:type="spellEnd"/>
+      <w:r>
+        <w:rPr>
+          <w:rFonts w:ascii="Arial" w:hAnsi="Arial" w:cs="Arial"/>
+        </w:rPr>
+        <w:t xml:space="preserve"> Nations Office </w:t>
+      </w:r>
+      <w:proofErr w:type="spellStart"/>
+      <w:r>
+        <w:rPr>
+          <w:rFonts w:ascii="Arial" w:hAnsi="Arial" w:cs="Arial"/>
+        </w:rPr>
+        <w:t>on</w:t>
+      </w:r>
+      <w:proofErr w:type="spellEnd"/>
+      <w:r>
+        <w:rPr>
+          <w:rFonts w:ascii="Arial" w:hAnsi="Arial" w:cs="Arial"/>
+        </w:rPr>
+        <w:t xml:space="preserve"> Drugs and </w:t>
+      </w:r>
+      <w:proofErr w:type="spellStart"/>
+      <w:r>
+        <w:rPr>
+          <w:rFonts w:ascii="Arial" w:hAnsi="Arial" w:cs="Arial"/>
+        </w:rPr>
+        <w:t>Crime</w:t>
+      </w:r>
+      <w:proofErr w:type="spellEnd"/>
+      <w:r>
+        <w:rPr>
+          <w:rFonts w:ascii="Arial" w:hAnsi="Arial" w:cs="Arial"/>
+        </w:rPr>
+        <w:t xml:space="preserve"> </w:t>
       </w:r>
       <w:r>
         <w:rPr>
@@ -4795,7 +5084,49 @@
           <w:rFonts w:ascii="Arial" w:hAnsi="Arial" w:cs="Arial"/>
         </w:rPr>
         <w:lastRenderedPageBreak/>
-        <w:t>proliferación de armas de destrucción masiva, y sus recomendaciones son reconocidas como el estándar global en la materia (Financial Action Task Force [FATF], 202</w:t>
+        <w:t>proliferación de armas de destrucción masiva, y sus recomendaciones son reconocidas como el estándar global en la materia (</w:t>
+      </w:r>
+      <w:proofErr w:type="spellStart"/>
+      <w:r>
+        <w:rPr>
+          <w:rFonts w:ascii="Arial" w:hAnsi="Arial" w:cs="Arial"/>
+        </w:rPr>
+        <w:t>Financial</w:t>
+      </w:r>
+      <w:proofErr w:type="spellEnd"/>
+      <w:r>
+        <w:rPr>
+          <w:rFonts w:ascii="Arial" w:hAnsi="Arial" w:cs="Arial"/>
+        </w:rPr>
+        <w:t xml:space="preserve"> </w:t>
+      </w:r>
+      <w:proofErr w:type="spellStart"/>
+      <w:r>
+        <w:rPr>
+          <w:rFonts w:ascii="Arial" w:hAnsi="Arial" w:cs="Arial"/>
+        </w:rPr>
+        <w:t>Action</w:t>
+      </w:r>
+      <w:proofErr w:type="spellEnd"/>
+      <w:r>
+        <w:rPr>
+          <w:rFonts w:ascii="Arial" w:hAnsi="Arial" w:cs="Arial"/>
+        </w:rPr>
+        <w:t xml:space="preserve"> </w:t>
+      </w:r>
+      <w:proofErr w:type="spellStart"/>
+      <w:r>
+        <w:rPr>
+          <w:rFonts w:ascii="Arial" w:hAnsi="Arial" w:cs="Arial"/>
+        </w:rPr>
+        <w:t>Task</w:t>
+      </w:r>
+      <w:proofErr w:type="spellEnd"/>
+      <w:r>
+        <w:rPr>
+          <w:rFonts w:ascii="Arial" w:hAnsi="Arial" w:cs="Arial"/>
+        </w:rPr>
+        <w:t xml:space="preserve"> Force [FATF], 202</w:t>
       </w:r>
       <w:r>
         <w:rPr>
@@ -4915,7 +5246,21 @@
         <w:rPr>
           <w:rFonts w:ascii="Arial" w:hAnsi="Arial" w:cs="Arial"/>
         </w:rPr>
-        <w:t>Este esfuerzo internacional se vio reflejado en México de manera gradual: en 1990 se incorporó el delito de lavado de dinero al Código Fiscal de la Federación, se emitieron las primeras disposiciones generales para el sistema financiero y, en 2000, el país ingresó como miembro de pleno derecho al GAFI (Núñez Camacho, 2008, pp. xxi-xxii)</w:t>
+        <w:t xml:space="preserve">Este esfuerzo internacional se vio reflejado en México de manera gradual: en 1990 se incorporó el delito de lavado de dinero al Código Fiscal de la Federación, se emitieron las primeras disposiciones generales para el sistema financiero y, en 2000, el país ingresó como miembro de pleno derecho al GAFI (Núñez Camacho, 2008, pp. </w:t>
+      </w:r>
+      <w:proofErr w:type="spellStart"/>
+      <w:r>
+        <w:rPr>
+          <w:rFonts w:ascii="Arial" w:hAnsi="Arial" w:cs="Arial"/>
+        </w:rPr>
+        <w:t>xxi-xxii</w:t>
+      </w:r>
+      <w:proofErr w:type="spellEnd"/>
+      <w:r>
+        <w:rPr>
+          <w:rFonts w:ascii="Arial" w:hAnsi="Arial" w:cs="Arial"/>
+        </w:rPr>
+        <w:t>)</w:t>
       </w:r>
       <w:r>
         <w:rPr>
@@ -4945,7 +5290,21 @@
         <w:rPr>
           <w:rFonts w:ascii="Arial" w:hAnsi="Arial" w:cs="Arial"/>
         </w:rPr>
-        <w:t>, ese marco se traduce en la obligación de contar con sistemas automatizados que detecten y monitoreen operaciones, generen alertas y sustenten el reporte de operaciones inusuales (CNBV, 2017, diap. 25 y 31). Sin embargo, la Evaluación Nacional de Riesgos reconoce deficiencias en estos sistemas, principalmente en la parametrización de sus escenarios de alerta (UIF, 2023, p. 23).</w:t>
+        <w:t xml:space="preserve">, ese marco se traduce en la obligación de contar con sistemas automatizados que detecten y monitoreen operaciones, generen alertas y sustenten el reporte de operaciones inusuales (CNBV, 2017, </w:t>
+      </w:r>
+      <w:proofErr w:type="spellStart"/>
+      <w:r>
+        <w:rPr>
+          <w:rFonts w:ascii="Arial" w:hAnsi="Arial" w:cs="Arial"/>
+        </w:rPr>
+        <w:t>diap</w:t>
+      </w:r>
+      <w:proofErr w:type="spellEnd"/>
+      <w:r>
+        <w:rPr>
+          <w:rFonts w:ascii="Arial" w:hAnsi="Arial" w:cs="Arial"/>
+        </w:rPr>
+        <w:t>. 25 y 31). Sin embargo, la Evaluación Nacional de Riesgos reconoce deficiencias en estos sistemas, principalmente en la parametrización de sus escenarios de alerta (UIF, 2023, p. 23).</w:t>
       </w:r>
     </w:p>
     <w:p>
@@ -5000,7 +5359,21 @@
         <w:rPr>
           <w:rFonts w:ascii="Arial" w:hAnsi="Arial" w:cs="Arial"/>
         </w:rPr>
-        <w:t>, los modelos que detectan operaciones sospechosas pierden eficacia con el tiempo, porque cambian los datos y también las formas de operar de quienes lavan dinero (Gama et ál., 2014; Rocha-Salazar et ál., 2021). Además, hay que confirmar que una operación fue realmente lavado de dinero</w:t>
+        <w:t xml:space="preserve">, los modelos que detectan operaciones sospechosas pierden eficacia con el tiempo, porque cambian los datos y también las formas de operar de quienes lavan dinero (Gama et ál., 2014; Rocha-Salazar et ál., 2021). Además, hay que confirmar que una operación fue realmente </w:t>
+      </w:r>
+      <w:proofErr w:type="gramStart"/>
+      <w:r>
+        <w:rPr>
+          <w:rFonts w:ascii="Arial" w:hAnsi="Arial" w:cs="Arial"/>
+        </w:rPr>
+        <w:t>lavado</w:t>
+      </w:r>
+      <w:proofErr w:type="gramEnd"/>
+      <w:r>
+        <w:rPr>
+          <w:rFonts w:ascii="Arial" w:hAnsi="Arial" w:cs="Arial"/>
+        </w:rPr>
+        <w:t xml:space="preserve"> de dinero</w:t>
       </w:r>
       <w:r>
         <w:rPr>
@@ -5094,6 +5467,12 @@
           <w:bCs/>
         </w:rPr>
       </w:pPr>
+      <w:r>
+        <w:rPr>
+          <w:rFonts w:ascii="Arial" w:hAnsi="Arial" w:cs="Arial"/>
+        </w:rPr>
+        <w:t xml:space="preserve">         </w:t>
+      </w:r>
       <w:r>
         <w:rPr>
           <w:rFonts w:ascii="Arial" w:hAnsi="Arial" w:cs="Arial"/>
@@ -5418,7 +5797,21 @@
         <w:rPr>
           <w:rFonts w:ascii="Arial" w:hAnsi="Arial" w:cs="Arial"/>
         </w:rPr>
-        <w:t>El uso de agentes y modelos de lenguaje para combatir el lavado de dinero se ha centrado en detectar operaciones sospechosas (Mohamed et ál., 2026; Pirmorad, 2025), mientras que</w:t>
+        <w:t xml:space="preserve">El uso de agentes y modelos de lenguaje para combatir el lavado de dinero se ha centrado en detectar operaciones sospechosas (Mohamed et ál., 2026; </w:t>
+      </w:r>
+      <w:proofErr w:type="spellStart"/>
+      <w:r>
+        <w:rPr>
+          <w:rFonts w:ascii="Arial" w:hAnsi="Arial" w:cs="Arial"/>
+        </w:rPr>
+        <w:t>Pirmorad</w:t>
+      </w:r>
+      <w:proofErr w:type="spellEnd"/>
+      <w:r>
+        <w:rPr>
+          <w:rFonts w:ascii="Arial" w:hAnsi="Arial" w:cs="Arial"/>
+        </w:rPr>
+        <w:t>, 2025), mientras que</w:t>
       </w:r>
       <w:r>
         <w:rPr>
@@ -5490,19 +5883,7 @@
         <w:rPr>
           <w:rFonts w:ascii="Arial" w:hAnsi="Arial" w:cs="Arial"/>
         </w:rPr>
-        <w:t xml:space="preserve">, pues los </w:t>
-      </w:r>
-      <w:r>
-        <w:rPr>
-          <w:rFonts w:ascii="Arial" w:hAnsi="Arial" w:cs="Arial"/>
-        </w:rPr>
-        <w:t>agentes se</w:t>
-      </w:r>
-      <w:r>
-        <w:rPr>
-          <w:rFonts w:ascii="Arial" w:hAnsi="Arial" w:cs="Arial"/>
-        </w:rPr>
-        <w:t xml:space="preserve"> emplean</w:t>
+        <w:t>, pues los agentes se emplean</w:t>
       </w:r>
       <w:r>
         <w:rPr>
@@ -5813,6 +6194,7 @@
     </w:p>
     <w:p>
       <w:pPr>
+        <w:spacing w:line="276" w:lineRule="auto"/>
         <w:jc w:val="both"/>
         <w:rPr>
           <w:rFonts w:ascii="Arial" w:hAnsi="Arial" w:cs="Arial"/>
@@ -5828,7 +6210,13 @@
         <w:rPr>
           <w:rFonts w:ascii="Arial" w:hAnsi="Arial" w:cs="Arial"/>
         </w:rPr>
-        <w:t>Evaluar en qué medida un sistema de agentes de inteligencia artificial detecta a tiempo y explica la pérdida de eficiencia de un modelo de detección de lavado de dinero, en comparación con el monitoreo tradicional basado en reglas y umbrales fijos, en un entorno de producción simulado.</w:t>
+        <w:t>Evaluar en qué medida un sistema de agentes de inteligencia artificial detecta a tiempo y explica la pérdida de eficiencia de un modelo de detección de lavado de dinero, en comparación con el monitoreo tradicional basado en reglas y umbrales fijos, en un entorno de producción simulado</w:t>
+      </w:r>
+      <w:r>
+        <w:rPr>
+          <w:rFonts w:ascii="Arial" w:hAnsi="Arial" w:cs="Arial"/>
+        </w:rPr>
+        <w:t>, para aportar evidencia sobre su utilidad en la vigilancia de estos modelos.</w:t>
       </w:r>
     </w:p>
     <w:p>
@@ -5891,6 +6279,7 @@
     <w:p>
       <w:pPr>
         <w:pStyle w:val="Prrafodelista"/>
+        <w:jc w:val="both"/>
         <w:rPr>
           <w:rFonts w:ascii="Arial" w:hAnsi="Arial" w:cs="Arial"/>
         </w:rPr>
@@ -5899,6 +6288,7 @@
     <w:p>
       <w:pPr>
         <w:pStyle w:val="Prrafodelista"/>
+        <w:spacing w:line="276" w:lineRule="auto"/>
         <w:jc w:val="both"/>
         <w:rPr>
           <w:rFonts w:ascii="Arial" w:hAnsi="Arial" w:cs="Arial"/>
@@ -5907,6 +6297,8 @@
       <w:r>
         <w:rPr>
           <w:rFonts w:ascii="Arial" w:hAnsi="Arial" w:cs="Arial"/>
+          <w:sz w:val="24"/>
+          <w:szCs w:val="24"/>
         </w:rPr>
         <w:t>Establecer escenarios simulados en los que un modelo de detección de lavado de dinero pierde eficacia por causas conocidas, para contar con referencias contra las cuales verificar la detección y el diagnostico</w:t>
       </w:r>
@@ -5928,20 +6320,43 @@
     <w:p>
       <w:pPr>
         <w:pStyle w:val="Prrafodelista"/>
+        <w:spacing w:line="276" w:lineRule="auto"/>
         <w:jc w:val="both"/>
         <w:rPr>
           <w:rFonts w:ascii="Arial" w:hAnsi="Arial" w:cs="Arial"/>
-        </w:rPr>
-      </w:pPr>
-      <w:r>
-        <w:rPr>
-          <w:rFonts w:ascii="Arial" w:hAnsi="Arial" w:cs="Arial"/>
-        </w:rPr>
-        <w:t>Determinar el tiempo con que el sistema de agentes detecta la perdida de eficiencia y la proporción de causas que identifica correctamente, para medir su oportunidad y exactitud</w:t>
-      </w:r>
-      <w:r>
-        <w:rPr>
-          <w:rFonts w:ascii="Arial" w:hAnsi="Arial" w:cs="Arial"/>
+          <w:sz w:val="24"/>
+          <w:szCs w:val="24"/>
+        </w:rPr>
+      </w:pPr>
+      <w:r>
+        <w:rPr>
+          <w:rFonts w:ascii="Arial" w:hAnsi="Arial" w:cs="Arial"/>
+          <w:sz w:val="24"/>
+          <w:szCs w:val="24"/>
+        </w:rPr>
+        <w:t>Determinar el tiempo con que el sistema de agentes detecta la p</w:t>
+      </w:r>
+      <w:r>
+        <w:rPr>
+          <w:rFonts w:ascii="Arial" w:hAnsi="Arial" w:cs="Arial"/>
+          <w:sz w:val="24"/>
+          <w:szCs w:val="24"/>
+        </w:rPr>
+        <w:t>é</w:t>
+      </w:r>
+      <w:r>
+        <w:rPr>
+          <w:rFonts w:ascii="Arial" w:hAnsi="Arial" w:cs="Arial"/>
+          <w:sz w:val="24"/>
+          <w:szCs w:val="24"/>
+        </w:rPr>
+        <w:t>rdida de eficiencia y la proporción de causas que identifica correctamente, para medir su oportunidad y exactitud</w:t>
+      </w:r>
+      <w:r>
+        <w:rPr>
+          <w:rFonts w:ascii="Arial" w:hAnsi="Arial" w:cs="Arial"/>
+          <w:sz w:val="24"/>
+          <w:szCs w:val="24"/>
         </w:rPr>
         <w:t>.</w:t>
       </w:r>
@@ -5957,19 +6372,27 @@
     <w:p>
       <w:pPr>
         <w:pStyle w:val="Prrafodelista"/>
-        <w:rPr>
-          <w:rFonts w:ascii="Arial" w:hAnsi="Arial" w:cs="Arial"/>
-        </w:rPr>
-      </w:pPr>
-      <w:r>
-        <w:rPr>
-          <w:rFonts w:ascii="Arial" w:hAnsi="Arial" w:cs="Arial"/>
+        <w:spacing w:line="360" w:lineRule="auto"/>
+        <w:jc w:val="both"/>
+        <w:rPr>
+          <w:rFonts w:ascii="Arial" w:hAnsi="Arial" w:cs="Arial"/>
+          <w:sz w:val="24"/>
+          <w:szCs w:val="24"/>
+        </w:rPr>
+      </w:pPr>
+      <w:r>
+        <w:rPr>
+          <w:rFonts w:ascii="Arial" w:hAnsi="Arial" w:cs="Arial"/>
+          <w:sz w:val="24"/>
+          <w:szCs w:val="24"/>
         </w:rPr>
         <w:t>Contrastar el desempeño del sistema de agentes con el del monitoreo tradicional en esos mismos escenarios, para identificar en qué condiciones ofrece una ventaja</w:t>
       </w:r>
       <w:r>
         <w:rPr>
           <w:rFonts w:ascii="Arial" w:hAnsi="Arial" w:cs="Arial"/>
+          <w:sz w:val="24"/>
+          <w:szCs w:val="24"/>
         </w:rPr>
         <w:t>.</w:t>
       </w:r>
@@ -6267,12 +6690,14 @@
         </w:rPr>
         <w:t>1.1.1</w:t>
       </w:r>
+      <w:proofErr w:type="gramStart"/>
       <w:r>
         <w:rPr>
           <w:rFonts w:ascii="Arial" w:hAnsi="Arial" w:cs="Arial"/>
         </w:rPr>
         <w:t xml:space="preserve">   (</w:t>
       </w:r>
+      <w:proofErr w:type="gramEnd"/>
       <w:r>
         <w:rPr>
           <w:rFonts w:ascii="Arial" w:hAnsi="Arial" w:cs="Arial"/>
@@ -6688,12 +7113,14 @@
         </w:rPr>
         <w:t>1.1.1</w:t>
       </w:r>
+      <w:proofErr w:type="gramStart"/>
       <w:r>
         <w:rPr>
           <w:rFonts w:ascii="Arial" w:hAnsi="Arial" w:cs="Arial"/>
         </w:rPr>
         <w:t xml:space="preserve">   (</w:t>
       </w:r>
+      <w:proofErr w:type="gramEnd"/>
       <w:r>
         <w:rPr>
           <w:rFonts w:ascii="Arial" w:hAnsi="Arial" w:cs="Arial"/>
@@ -7087,12 +7514,14 @@
         </w:rPr>
         <w:t>1.1.1</w:t>
       </w:r>
+      <w:proofErr w:type="gramStart"/>
       <w:r>
         <w:rPr>
           <w:rFonts w:ascii="Arial" w:hAnsi="Arial" w:cs="Arial"/>
         </w:rPr>
         <w:t xml:space="preserve">   (</w:t>
       </w:r>
+      <w:proofErr w:type="gramEnd"/>
       <w:r>
         <w:rPr>
           <w:rFonts w:ascii="Arial" w:hAnsi="Arial" w:cs="Arial"/>
@@ -7608,6 +8037,7 @@
         </w:rPr>
         <w:t xml:space="preserve">. </w:t>
       </w:r>
+      <w:proofErr w:type="spellStart"/>
       <w:r>
         <w:rPr>
           <w:rFonts w:ascii="Arial" w:hAnsi="Arial" w:cs="Arial"/>
@@ -7615,6 +8045,7 @@
         </w:rPr>
         <w:t>Aranzadi</w:t>
       </w:r>
+      <w:proofErr w:type="spellEnd"/>
     </w:p>
     <w:p>
       <w:pPr>
@@ -7639,6 +8070,7 @@
         </w:rPr>
         <w:t xml:space="preserve">(s.f.). </w:t>
       </w:r>
+      <w:proofErr w:type="spellStart"/>
       <w:r>
         <w:rPr>
           <w:rFonts w:ascii="Arial" w:hAnsi="Arial" w:cs="Arial"/>
@@ -7647,6 +8079,7 @@
         </w:rPr>
         <w:t>Overview</w:t>
       </w:r>
+      <w:proofErr w:type="spellEnd"/>
       <w:r>
         <w:rPr>
           <w:rFonts w:ascii="Arial" w:hAnsi="Arial" w:cs="Arial"/>
@@ -7841,7 +8274,63 @@
         <w:rPr>
           <w:rFonts w:ascii="Arial" w:hAnsi="Arial" w:cs="Arial"/>
         </w:rPr>
-        <w:t xml:space="preserve">Gama, J., Žliobaitė, I., Bifet, A., Pechenizkiy, M. y Bouchachia, A. (2014). </w:t>
+        <w:t xml:space="preserve">Gama, J., </w:t>
+      </w:r>
+      <w:proofErr w:type="spellStart"/>
+      <w:r>
+        <w:rPr>
+          <w:rFonts w:ascii="Arial" w:hAnsi="Arial" w:cs="Arial"/>
+        </w:rPr>
+        <w:t>Žliobaitė</w:t>
+      </w:r>
+      <w:proofErr w:type="spellEnd"/>
+      <w:r>
+        <w:rPr>
+          <w:rFonts w:ascii="Arial" w:hAnsi="Arial" w:cs="Arial"/>
+        </w:rPr>
+        <w:t xml:space="preserve">, I., </w:t>
+      </w:r>
+      <w:proofErr w:type="spellStart"/>
+      <w:r>
+        <w:rPr>
+          <w:rFonts w:ascii="Arial" w:hAnsi="Arial" w:cs="Arial"/>
+        </w:rPr>
+        <w:t>Bifet</w:t>
+      </w:r>
+      <w:proofErr w:type="spellEnd"/>
+      <w:r>
+        <w:rPr>
+          <w:rFonts w:ascii="Arial" w:hAnsi="Arial" w:cs="Arial"/>
+        </w:rPr>
+        <w:t xml:space="preserve">, A., </w:t>
+      </w:r>
+      <w:proofErr w:type="spellStart"/>
+      <w:r>
+        <w:rPr>
+          <w:rFonts w:ascii="Arial" w:hAnsi="Arial" w:cs="Arial"/>
+        </w:rPr>
+        <w:t>Pechenizkiy</w:t>
+      </w:r>
+      <w:proofErr w:type="spellEnd"/>
+      <w:r>
+        <w:rPr>
+          <w:rFonts w:ascii="Arial" w:hAnsi="Arial" w:cs="Arial"/>
+        </w:rPr>
+        <w:t xml:space="preserve">, M. y </w:t>
+      </w:r>
+      <w:proofErr w:type="spellStart"/>
+      <w:r>
+        <w:rPr>
+          <w:rFonts w:ascii="Arial" w:hAnsi="Arial" w:cs="Arial"/>
+        </w:rPr>
+        <w:t>Bouchachia</w:t>
+      </w:r>
+      <w:proofErr w:type="spellEnd"/>
+      <w:r>
+        <w:rPr>
+          <w:rFonts w:ascii="Arial" w:hAnsi="Arial" w:cs="Arial"/>
+        </w:rPr>
+        <w:t xml:space="preserve">, A. (2014). </w:t>
       </w:r>
       <w:r>
         <w:rPr>
@@ -7864,7 +8353,23 @@
           <w:rFonts w:ascii="Arial" w:hAnsi="Arial" w:cs="Arial"/>
           <w:lang w:val="en-US"/>
         </w:rPr>
-        <w:t>(4), Artículo 44.</w:t>
+        <w:t xml:space="preserve">(4), </w:t>
+      </w:r>
+      <w:proofErr w:type="spellStart"/>
+      <w:r>
+        <w:rPr>
+          <w:rFonts w:ascii="Arial" w:hAnsi="Arial" w:cs="Arial"/>
+          <w:lang w:val="en-US"/>
+        </w:rPr>
+        <w:t>Artículo</w:t>
+      </w:r>
+      <w:proofErr w:type="spellEnd"/>
+      <w:r>
+        <w:rPr>
+          <w:rFonts w:ascii="Arial" w:hAnsi="Arial" w:cs="Arial"/>
+          <w:lang w:val="en-US"/>
+        </w:rPr>
+        <w:t xml:space="preserve"> 44.</w:t>
       </w:r>
     </w:p>
     <w:p>
@@ -7884,7 +8389,43 @@
           <w:highlight w:val="yellow"/>
           <w:lang w:val="en-US"/>
         </w:rPr>
-        <w:t xml:space="preserve">Sethi, A., Gupta, P., Kansotia, S., Kant, K. y Srivasatava, N. (2026). Proactive detection of model degradation in financial fraud prediction with delayed </w:t>
+        <w:t xml:space="preserve">Sethi, A., Gupta, P., </w:t>
+      </w:r>
+      <w:proofErr w:type="spellStart"/>
+      <w:r>
+        <w:rPr>
+          <w:rFonts w:ascii="Arial" w:hAnsi="Arial" w:cs="Arial"/>
+          <w:highlight w:val="yellow"/>
+          <w:lang w:val="en-US"/>
+        </w:rPr>
+        <w:t>Kansotia</w:t>
+      </w:r>
+      <w:proofErr w:type="spellEnd"/>
+      <w:r>
+        <w:rPr>
+          <w:rFonts w:ascii="Arial" w:hAnsi="Arial" w:cs="Arial"/>
+          <w:highlight w:val="yellow"/>
+          <w:lang w:val="en-US"/>
+        </w:rPr>
+        <w:t xml:space="preserve">, S., Kant, K. y </w:t>
+      </w:r>
+      <w:proofErr w:type="spellStart"/>
+      <w:r>
+        <w:rPr>
+          <w:rFonts w:ascii="Arial" w:hAnsi="Arial" w:cs="Arial"/>
+          <w:highlight w:val="yellow"/>
+          <w:lang w:val="en-US"/>
+        </w:rPr>
+        <w:t>Srivasatava</w:t>
+      </w:r>
+      <w:proofErr w:type="spellEnd"/>
+      <w:r>
+        <w:rPr>
+          <w:rFonts w:ascii="Arial" w:hAnsi="Arial" w:cs="Arial"/>
+          <w:highlight w:val="yellow"/>
+          <w:lang w:val="en-US"/>
+        </w:rPr>
+        <w:t xml:space="preserve">, N. (2026). Proactive detection of model degradation in financial fraud prediction with delayed </w:t>
       </w:r>
       <w:r>
         <w:rPr>
@@ -7946,6 +8487,7 @@
         </w:rPr>
         <w:t xml:space="preserve">, </w:t>
       </w:r>
+      <w:proofErr w:type="spellStart"/>
       <w:r>
         <w:rPr>
           <w:rFonts w:ascii="Arial" w:hAnsi="Arial" w:cs="Arial"/>
@@ -7953,12 +8495,45 @@
         </w:rPr>
         <w:t>Zefan</w:t>
       </w:r>
+      <w:proofErr w:type="spellEnd"/>
       <w:r>
         <w:rPr>
           <w:rFonts w:ascii="Arial" w:hAnsi="Arial" w:cs="Arial"/>
           <w:lang w:val="en-US"/>
         </w:rPr>
-        <w:t xml:space="preserve">., et ál. (2024). RCAgent: Cloud root cause analysis by autonomous agents with tool-augmented large language models. En </w:t>
+        <w:t xml:space="preserve">., et </w:t>
+      </w:r>
+      <w:proofErr w:type="spellStart"/>
+      <w:r>
+        <w:rPr>
+          <w:rFonts w:ascii="Arial" w:hAnsi="Arial" w:cs="Arial"/>
+          <w:lang w:val="en-US"/>
+        </w:rPr>
+        <w:t>ál</w:t>
+      </w:r>
+      <w:proofErr w:type="spellEnd"/>
+      <w:r>
+        <w:rPr>
+          <w:rFonts w:ascii="Arial" w:hAnsi="Arial" w:cs="Arial"/>
+          <w:lang w:val="en-US"/>
+        </w:rPr>
+        <w:t xml:space="preserve">. (2024). </w:t>
+      </w:r>
+      <w:proofErr w:type="spellStart"/>
+      <w:r>
+        <w:rPr>
+          <w:rFonts w:ascii="Arial" w:hAnsi="Arial" w:cs="Arial"/>
+          <w:lang w:val="en-US"/>
+        </w:rPr>
+        <w:t>RCAgent</w:t>
+      </w:r>
+      <w:proofErr w:type="spellEnd"/>
+      <w:r>
+        <w:rPr>
+          <w:rFonts w:ascii="Arial" w:hAnsi="Arial" w:cs="Arial"/>
+          <w:lang w:val="en-US"/>
+        </w:rPr>
+        <w:t xml:space="preserve">: Cloud root cause analysis by autonomous agents with tool-augmented large language models. En </w:t>
       </w:r>
       <w:r>
         <w:rPr>
@@ -7991,7 +8566,6 @@
         <w:jc w:val="both"/>
         <w:rPr>
           <w:rFonts w:ascii="Arial" w:hAnsi="Arial" w:cs="Arial"/>
-          <w:lang w:val="en-US"/>
         </w:rPr>
       </w:pPr>
       <w:r>
@@ -8032,6 +8606,7 @@
         <w:jc w:val="both"/>
         <w:rPr>
           <w:rFonts w:ascii="Arial" w:hAnsi="Arial" w:cs="Arial"/>
+          <w:lang w:val="en-US"/>
         </w:rPr>
       </w:pPr>
       <w:r>
@@ -8052,12 +8627,14 @@
           <w:rFonts w:ascii="Arial" w:hAnsi="Arial" w:cs="Arial"/>
           <w:i/>
           <w:iCs/>
+          <w:lang w:val="en-US"/>
         </w:rPr>
         <w:t>IEEE Access, 11</w:t>
       </w:r>
       <w:r>
         <w:rPr>
           <w:rFonts w:ascii="Arial" w:hAnsi="Arial" w:cs="Arial"/>
+          <w:lang w:val="en-US"/>
         </w:rPr>
         <w:t>, 8889-8903</w:t>
       </w:r>
@@ -8070,14 +8647,31 @@
         <w:jc w:val="both"/>
         <w:rPr>
           <w:rFonts w:ascii="Arial" w:hAnsi="Arial" w:cs="Arial"/>
-        </w:rPr>
-      </w:pPr>
-      <w:r>
-        <w:rPr>
-          <w:rFonts w:ascii="Arial" w:hAnsi="Arial" w:cs="Arial"/>
           <w:lang w:val="en-US"/>
         </w:rPr>
-        <w:t xml:space="preserve">Mohamed, R. E., Hussain, M., Jadidi, Z., Foo, E. y Azam, S. (2026). Towards agentic AI swarm modeling for blockchain-based money laundering detection. En S. Pal, K. Biswas, S. Kanhere, T. Myers y V. Muthukkumarasamy (Eds.), </w:t>
+      </w:pPr>
+      <w:r>
+        <w:rPr>
+          <w:rFonts w:ascii="Arial" w:hAnsi="Arial" w:cs="Arial"/>
+          <w:lang w:val="en-US"/>
+        </w:rPr>
+        <w:t xml:space="preserve">Mohamed, R. E., Hussain, M., Jadidi, Z., Foo, E. y Azam, S. (2026). Towards agentic AI swarm modeling for blockchain-based money laundering detection. En S. Pal, K. Biswas, S. Kanhere, T. Myers y V. </w:t>
+      </w:r>
+      <w:proofErr w:type="spellStart"/>
+      <w:r>
+        <w:rPr>
+          <w:rFonts w:ascii="Arial" w:hAnsi="Arial" w:cs="Arial"/>
+          <w:lang w:val="en-US"/>
+        </w:rPr>
+        <w:t>Muthukkumarasamy</w:t>
+      </w:r>
+      <w:proofErr w:type="spellEnd"/>
+      <w:r>
+        <w:rPr>
+          <w:rFonts w:ascii="Arial" w:hAnsi="Arial" w:cs="Arial"/>
+          <w:lang w:val="en-US"/>
+        </w:rPr>
+        <w:t xml:space="preserve"> (Eds.), </w:t>
       </w:r>
       <w:r>
         <w:rPr>
@@ -8098,6 +8692,7 @@
       <w:r>
         <w:rPr>
           <w:rFonts w:ascii="Arial" w:hAnsi="Arial" w:cs="Arial"/>
+          <w:lang w:val="en-US"/>
         </w:rPr>
         <w:t>Springer</w:t>
       </w:r>
@@ -8112,12 +8707,21 @@
           <w:rFonts w:ascii="Arial" w:hAnsi="Arial" w:cs="Arial"/>
         </w:rPr>
       </w:pPr>
+      <w:proofErr w:type="spellStart"/>
       <w:r>
         <w:rPr>
           <w:rFonts w:ascii="Arial" w:hAnsi="Arial" w:cs="Arial"/>
           <w:lang w:val="en-US"/>
         </w:rPr>
-        <w:t xml:space="preserve">Pirmorad, E. (2025). </w:t>
+        <w:t>Pirmorad</w:t>
+      </w:r>
+      <w:proofErr w:type="spellEnd"/>
+      <w:r>
+        <w:rPr>
+          <w:rFonts w:ascii="Arial" w:hAnsi="Arial" w:cs="Arial"/>
+          <w:lang w:val="en-US"/>
+        </w:rPr>
+        <w:t xml:space="preserve">, E. (2025). </w:t>
       </w:r>
       <w:r>
         <w:rPr>
@@ -8133,7 +8737,23 @@
           <w:rFonts w:ascii="Arial" w:hAnsi="Arial" w:cs="Arial"/>
           <w:lang w:val="en-US"/>
         </w:rPr>
-        <w:t xml:space="preserve"> [Preprint]. arXiv. </w:t>
+        <w:t xml:space="preserve"> [Preprint]. </w:t>
+      </w:r>
+      <w:proofErr w:type="spellStart"/>
+      <w:r>
+        <w:rPr>
+          <w:rFonts w:ascii="Arial" w:hAnsi="Arial" w:cs="Arial"/>
+          <w:lang w:val="en-US"/>
+        </w:rPr>
+        <w:t>arXiv</w:t>
+      </w:r>
+      <w:proofErr w:type="spellEnd"/>
+      <w:r>
+        <w:rPr>
+          <w:rFonts w:ascii="Arial" w:hAnsi="Arial" w:cs="Arial"/>
+          <w:lang w:val="en-US"/>
+        </w:rPr>
+        <w:t xml:space="preserve">. </w:t>
       </w:r>
       <w:hyperlink r:id="rId14" w:history="1">
         <w:r>
@@ -8153,13 +8773,42 @@
         <w:jc w:val="both"/>
         <w:rPr>
           <w:rFonts w:ascii="Arial" w:hAnsi="Arial" w:cs="Arial"/>
-        </w:rPr>
-      </w:pPr>
-      <w:r>
-        <w:rPr>
-          <w:rFonts w:ascii="Arial" w:hAnsi="Arial" w:cs="Arial"/>
-        </w:rPr>
-        <w:t xml:space="preserve">Sethi, A., Gupta, P., Kansotia, S., Kant, K. y Srivasatava, N. (2026). </w:t>
+          <w:lang w:val="de-DE"/>
+        </w:rPr>
+      </w:pPr>
+      <w:r>
+        <w:rPr>
+          <w:rFonts w:ascii="Arial" w:hAnsi="Arial" w:cs="Arial"/>
+        </w:rPr>
+        <w:t xml:space="preserve">Sethi, A., Gupta, P., </w:t>
+      </w:r>
+      <w:proofErr w:type="spellStart"/>
+      <w:r>
+        <w:rPr>
+          <w:rFonts w:ascii="Arial" w:hAnsi="Arial" w:cs="Arial"/>
+        </w:rPr>
+        <w:t>Kansotia</w:t>
+      </w:r>
+      <w:proofErr w:type="spellEnd"/>
+      <w:r>
+        <w:rPr>
+          <w:rFonts w:ascii="Arial" w:hAnsi="Arial" w:cs="Arial"/>
+        </w:rPr>
+        <w:t xml:space="preserve">, S., Kant, K. y </w:t>
+      </w:r>
+      <w:proofErr w:type="spellStart"/>
+      <w:r>
+        <w:rPr>
+          <w:rFonts w:ascii="Arial" w:hAnsi="Arial" w:cs="Arial"/>
+        </w:rPr>
+        <w:t>Srivasatava</w:t>
+      </w:r>
+      <w:proofErr w:type="spellEnd"/>
+      <w:r>
+        <w:rPr>
+          <w:rFonts w:ascii="Arial" w:hAnsi="Arial" w:cs="Arial"/>
+        </w:rPr>
+        <w:t xml:space="preserve">, N. (2026). </w:t>
       </w:r>
       <w:r>
         <w:rPr>
@@ -8187,6 +8836,7 @@
       <w:r>
         <w:rPr>
           <w:rFonts w:ascii="Arial" w:hAnsi="Arial" w:cs="Arial"/>
+          <w:lang w:val="de-DE"/>
         </w:rPr>
         <w:t>Springer.</w:t>
       </w:r>
@@ -8199,21 +8849,31 @@
         <w:jc w:val="both"/>
         <w:rPr>
           <w:rFonts w:ascii="Arial" w:hAnsi="Arial" w:cs="Arial"/>
-        </w:rPr>
-      </w:pPr>
-      <w:r>
-        <w:rPr>
-          <w:rFonts w:ascii="Arial" w:hAnsi="Arial" w:cs="Arial"/>
           <w:lang w:val="de-DE"/>
         </w:rPr>
+      </w:pPr>
+      <w:r>
+        <w:rPr>
+          <w:rFonts w:ascii="Arial" w:hAnsi="Arial" w:cs="Arial"/>
+          <w:lang w:val="de-DE"/>
+        </w:rPr>
         <w:t xml:space="preserve">Wang, Z., Liu, Z., Zhang, Y., Zhong, A., Wang, J., Yin, F., Fan, L., Wu, L. y Wen, Q. (2024). </w:t>
       </w:r>
+      <w:proofErr w:type="spellStart"/>
       <w:r>
         <w:rPr>
           <w:rFonts w:ascii="Arial" w:hAnsi="Arial" w:cs="Arial"/>
           <w:lang w:val="en-US"/>
         </w:rPr>
-        <w:t xml:space="preserve">RCAgent: Cloud root cause analysis by autonomous agents with tool-augmented large language models. En </w:t>
+        <w:t>RCAgent</w:t>
+      </w:r>
+      <w:proofErr w:type="spellEnd"/>
+      <w:r>
+        <w:rPr>
+          <w:rFonts w:ascii="Arial" w:hAnsi="Arial" w:cs="Arial"/>
+          <w:lang w:val="en-US"/>
+        </w:rPr>
+        <w:t xml:space="preserve">: Cloud root cause analysis by autonomous agents with tool-augmented large language models. En </w:t>
       </w:r>
       <w:r>
         <w:rPr>
@@ -8234,6 +8894,7 @@
       <w:r>
         <w:rPr>
           <w:rFonts w:ascii="Arial" w:hAnsi="Arial" w:cs="Arial"/>
+          <w:lang w:val="de-DE"/>
         </w:rPr>
         <w:t>ACM.</w:t>
       </w:r>
@@ -8279,7 +8940,27 @@
           <w:iCs/>
           <w:lang w:val="en-US"/>
         </w:rPr>
-        <w:t>Advances in Neural Information Processing Systems 36 (NeurIPS 2023), Datasets and Benchmarks Track</w:t>
+        <w:t>Advances in Neural Information Processing Systems 36 (</w:t>
+      </w:r>
+      <w:proofErr w:type="spellStart"/>
+      <w:r>
+        <w:rPr>
+          <w:rFonts w:ascii="Arial" w:hAnsi="Arial" w:cs="Arial"/>
+          <w:i/>
+          <w:iCs/>
+          <w:lang w:val="en-US"/>
+        </w:rPr>
+        <w:t>NeurIPS</w:t>
+      </w:r>
+      <w:proofErr w:type="spellEnd"/>
+      <w:r>
+        <w:rPr>
+          <w:rFonts w:ascii="Arial" w:hAnsi="Arial" w:cs="Arial"/>
+          <w:i/>
+          <w:iCs/>
+          <w:lang w:val="en-US"/>
+        </w:rPr>
+        <w:t xml:space="preserve"> 2023), Datasets and Benchmarks Track</w:t>
       </w:r>
       <w:r>
         <w:rPr>
@@ -9875,6 +10556,7 @@
   <w:style w:type="character" w:default="1" w:styleId="Fuentedeprrafopredeter">
     <w:name w:val="Default Paragraph Font"/>
     <w:uiPriority w:val="1"/>
+    <w:semiHidden/>
     <w:unhideWhenUsed/>
   </w:style>
   <w:style w:type="table" w:default="1" w:styleId="Tablanormal">
@@ -10356,6 +11038,23 @@
 </file>
 
 <file path=customXml/item1.xml><?xml version="1.0" encoding="utf-8"?>
+<p:properties xmlns:p="http://schemas.microsoft.com/office/2006/metadata/properties" xmlns:xsi="http://www.w3.org/2001/XMLSchema-instance" xmlns:pc="http://schemas.microsoft.com/office/infopath/2007/PartnerControls">
+  <documentManagement>
+    <ReferenceId xmlns="d921d922-e586-4070-94cf-401e9ff1332c" xsi:nil="true"/>
+  </documentManagement>
+</p:properties>
+</file>
+
+<file path=customXml/item2.xml><?xml version="1.0" encoding="utf-8"?>
+<?mso-contentType ?>
+<FormTemplates xmlns="http://schemas.microsoft.com/sharepoint/v3/contenttype/forms">
+  <Display>DocumentLibraryForm</Display>
+  <Edit>DocumentLibraryForm</Edit>
+  <New>DocumentLibraryForm</New>
+</FormTemplates>
+</file>
+
+<file path=customXml/item3.xml><?xml version="1.0" encoding="utf-8"?>
 <ct:contentTypeSchema xmlns:ct="http://schemas.microsoft.com/office/2006/metadata/contentType" xmlns:ma="http://schemas.microsoft.com/office/2006/metadata/properties/metaAttributes" ct:_="" ma:_="" ma:contentTypeName="Document" ma:contentTypeID="0x0101006AF304BD0D0B7C4698522C08709C00BB" ma:contentTypeVersion="4" ma:contentTypeDescription="Create a new document." ma:contentTypeScope="" ma:versionID="d87bf246123dbc96f665515db9402ea3">
   <xsd:schema xmlns:xsd="http://www.w3.org/2001/XMLSchema" xmlns:xs="http://www.w3.org/2001/XMLSchema" xmlns:p="http://schemas.microsoft.com/office/2006/metadata/properties" xmlns:ns2="d921d922-e586-4070-94cf-401e9ff1332c" targetNamespace="http://schemas.microsoft.com/office/2006/metadata/properties" ma:root="true" ma:fieldsID="814706c9f71ffcccbcbebef487bdee00" ns2:_="">
     <xsd:import namespace="d921d922-e586-4070-94cf-401e9ff1332c"/>
@@ -10499,24 +11198,25 @@
 </ct:contentTypeSchema>
 </file>
 
-<file path=customXml/item2.xml><?xml version="1.0" encoding="utf-8"?>
-<?mso-contentType ?>
-<FormTemplates xmlns="http://schemas.microsoft.com/sharepoint/v3/contenttype/forms">
-  <Display>DocumentLibraryForm</Display>
-  <Edit>DocumentLibraryForm</Edit>
-  <New>DocumentLibraryForm</New>
-</FormTemplates>
+<file path=customXml/itemProps1.xml><?xml version="1.0" encoding="utf-8"?>
+<ds:datastoreItem xmlns:ds="http://schemas.openxmlformats.org/officeDocument/2006/customXml" ds:itemID="{0A485150-6D8C-4680-B13D-3C6444219884}">
+  <ds:schemaRefs>
+    <ds:schemaRef ds:uri="http://schemas.microsoft.com/office/2006/metadata/properties"/>
+    <ds:schemaRef ds:uri="http://schemas.microsoft.com/office/infopath/2007/PartnerControls"/>
+    <ds:schemaRef ds:uri="d921d922-e586-4070-94cf-401e9ff1332c"/>
+  </ds:schemaRefs>
+</ds:datastoreItem>
 </file>
 
-<file path=customXml/item3.xml><?xml version="1.0" encoding="utf-8"?>
-<p:properties xmlns:p="http://schemas.microsoft.com/office/2006/metadata/properties" xmlns:xsi="http://www.w3.org/2001/XMLSchema-instance" xmlns:pc="http://schemas.microsoft.com/office/infopath/2007/PartnerControls">
-  <documentManagement>
-    <ReferenceId xmlns="d921d922-e586-4070-94cf-401e9ff1332c" xsi:nil="true"/>
-  </documentManagement>
-</p:properties>
+<file path=customXml/itemProps2.xml><?xml version="1.0" encoding="utf-8"?>
+<ds:datastoreItem xmlns:ds="http://schemas.openxmlformats.org/officeDocument/2006/customXml" ds:itemID="{C7DAC258-E4DA-446C-926C-E7A60E0F13CC}">
+  <ds:schemaRefs>
+    <ds:schemaRef ds:uri="http://schemas.microsoft.com/sharepoint/v3/contenttype/forms"/>
+  </ds:schemaRefs>
+</ds:datastoreItem>
 </file>
 
-<file path=customXml/itemProps1.xml><?xml version="1.0" encoding="utf-8"?>
+<file path=customXml/itemProps3.xml><?xml version="1.0" encoding="utf-8"?>
 <ds:datastoreItem xmlns:ds="http://schemas.openxmlformats.org/officeDocument/2006/customXml" ds:itemID="{66617E81-A932-4195-A0D0-208078D8F9E1}">
   <ds:schemaRefs>
     <ds:schemaRef ds:uri="http://schemas.microsoft.com/office/2006/metadata/contentType"/>
@@ -10532,22 +11232,4 @@
     <ds:schemaRef ds:uri="http://schemas.microsoft.com/internal/obd"/>
   </ds:schemaRefs>
 </ds:datastoreItem>
-</file>
-
-<file path=customXml/itemProps2.xml><?xml version="1.0" encoding="utf-8"?>
-<ds:datastoreItem xmlns:ds="http://schemas.openxmlformats.org/officeDocument/2006/customXml" ds:itemID="{C7DAC258-E4DA-446C-926C-E7A60E0F13CC}">
-  <ds:schemaRefs>
-    <ds:schemaRef ds:uri="http://schemas.microsoft.com/sharepoint/v3/contenttype/forms"/>
-  </ds:schemaRefs>
-</ds:datastoreItem>
-</file>
-
-<file path=customXml/itemProps3.xml><?xml version="1.0" encoding="utf-8"?>
-<ds:datastoreItem xmlns:ds="http://schemas.openxmlformats.org/officeDocument/2006/customXml" ds:itemID="{0A485150-6D8C-4680-B13D-3C6444219884}">
-  <ds:schemaRefs>
-    <ds:schemaRef ds:uri="http://schemas.microsoft.com/office/2006/metadata/properties"/>
-    <ds:schemaRef ds:uri="http://schemas.microsoft.com/office/infopath/2007/PartnerControls"/>
-    <ds:schemaRef ds:uri="d921d922-e586-4070-94cf-401e9ff1332c"/>
-  </ds:schemaRefs>
-</ds:datastoreItem>
 </file>
</xml_diff>